<commit_message>
Mobil entegrasyon belgeleri kanonik uclara guncellendi
</commit_message>
<xml_diff>
--- a/backend-docs/FLUTTER_INTEGRATION.docx
+++ b/backend-docs/FLUTTER_INTEGRATION.docx
@@ -1184,7 +1184,7 @@
         <w:rPr>
           <w:rStyle w:val="VerbatimChar"/>
         </w:rPr>
-        <w:t xml:space="preserve">POST /api/rooms/{roomId}/music/skip</w:t>
+        <w:t xml:space="preserve">DELETE /api/chat/rooms/{roomId}/music</w:t>
       </w:r>
     </w:p>
     <w:p>
@@ -1205,7 +1205,49 @@
         <w:rPr>
           <w:rStyle w:val="VerbatimChar"/>
         </w:rPr>
+        <w:t xml:space="preserve">POST /api/chat/rooms/{roomId}/music/stop</w:t>
+      </w:r>
+    </w:p>
+    <w:p>
+      <w:pPr>
+        <w:numPr>
+          <w:ilvl w:val="0"/>
+          <w:numId w:val="1004"/>
+        </w:numPr>
+        <w:pStyle w:val="Compact"/>
+      </w:pPr>
+      <w:r>
+        <w:t xml:space="preserve">(Eski</w:t>
+      </w:r>
+      <w:r>
+        <w:t xml:space="preserve"> </w:t>
+      </w:r>
+      <w:r>
+        <w:rPr>
+          <w:rStyle w:val="VerbatimChar"/>
+        </w:rPr>
+        <w:t xml:space="preserve">POST /api/rooms/{roomId}/music/skip</w:t>
+      </w:r>
+      <w:r>
+        <w:t xml:space="preserve"> </w:t>
+      </w:r>
+      <w:r>
+        <w:t xml:space="preserve">ve</w:t>
+      </w:r>
+      <w:r>
+        <w:t xml:space="preserve"> </w:t>
+      </w:r>
+      <w:r>
+        <w:rPr>
+          <w:rStyle w:val="VerbatimChar"/>
+        </w:rPr>
         <w:t xml:space="preserve">POST /api/rooms/{roomId}/music/stop</w:t>
+      </w:r>
+      <w:r>
+        <w:t xml:space="preserve"> </w:t>
+      </w:r>
+      <w:r>
+        <w:t xml:space="preserve">uçları hâlâ çalışır ama kullanımdan kaldırıldı.)</w:t>
       </w:r>
     </w:p>
     <w:p>
@@ -3268,21 +3310,6 @@
               </w:rPr>
               <w:t xml:space="preserve">GET /api/chat/rooms/{roomId}/music</w:t>
             </w:r>
-            <w:r>
-              <w:t xml:space="preserve"> </w:t>
-            </w:r>
-            <w:r>
-              <w:t xml:space="preserve">veya alias</w:t>
-            </w:r>
-            <w:r>
-              <w:t xml:space="preserve"> </w:t>
-            </w:r>
-            <w:r>
-              <w:rPr>
-                <w:rStyle w:val="VerbatimChar"/>
-              </w:rPr>
-              <w:t xml:space="preserve">GET /api/rooms/{roomId}/music/current</w:t>
-            </w:r>
           </w:p>
         </w:tc>
       </w:tr>
@@ -3339,7 +3366,7 @@
               <w:rPr>
                 <w:rStyle w:val="VerbatimChar"/>
               </w:rPr>
-              <w:t xml:space="preserve">POST /api/rooms/{roomId}/music/skip</w:t>
+              <w:t xml:space="preserve">DELETE /api/chat/rooms/{roomId}/music</w:t>
             </w:r>
           </w:p>
         </w:tc>
@@ -3368,7 +3395,7 @@
               <w:rPr>
                 <w:rStyle w:val="VerbatimChar"/>
               </w:rPr>
-              <w:t xml:space="preserve">POST /api/rooms/{roomId}/music/stop</w:t>
+              <w:t xml:space="preserve">POST /api/chat/rooms/{roomId}/music/stop</w:t>
             </w:r>
           </w:p>
         </w:tc>

</xml_diff>